<commit_message>
Fix cashflow error, audit azure services and update MCP connector functionality
</commit_message>
<xml_diff>
--- a/docs/Portal-AI-Connector-Team-Guide.docx
+++ b/docs/Portal-AI-Connector-Team-Guide.docx
@@ -209,17 +209,35 @@
         <w:spacing w:after="140" w:line="276"/>
       </w:pPr>
       <w:r>
-        <w:t xml:space="preserve">It can also take a small set of safe actions: post a message on a request’s conversation, add or complete a to-do, log to-do progress, and (for directors) save an AI skill. It </w:t>
-      </w:r>
-      <w:r>
-        <w:rPr>
-          <w:b/>
-          <w:bCs/>
-        </w:rPr>
-        <w:t xml:space="preserve">cannot</w:t>
-      </w:r>
-      <w:r>
-        <w:t xml:space="preserve"> approve anything, raise invoices, send emails or delete records — those stay in the portal.</w:t>
+        <w:t xml:space="preserve">And it can </w:t>
+      </w:r>
+      <w:r>
+        <w:rPr>
+          <w:b/>
+          <w:bCs/>
+        </w:rPr>
+        <w:t xml:space="preserve">do</w:t>
+      </w:r>
+      <w:r>
+        <w:t xml:space="preserve"> things — everything your portal account can do, not just read: creating and editing requests, RFIs, variations, work orders and bid packages; moving statuses; approving; raising and issuing valuation invoices; managing to-dos and calendar events; sending the portal’s emails. Ask it “what can you do for me here?” and it will list the actions your role allows.</w:t>
+      </w:r>
+    </w:p>
+    <w:p>
+      <w:pPr>
+        <w:spacing w:after="140" w:line="276"/>
+      </w:pPr>
+      <w:r>
+        <w:t xml:space="preserve">Your permissions are the AI’s permissions: if you can’t do it by clicking, your AI can’t do it either — and every action is performed </w:t>
+      </w:r>
+      <w:r>
+        <w:rPr>
+          <w:b/>
+          <w:bCs/>
+        </w:rPr>
+        <w:t xml:space="preserve">as you</w:t>
+      </w:r>
+      <w:r>
+        <w:t xml:space="preserve"> and logged under your name. For anything consequential (approvals, money, emails to clients or subcontractors, deletions) a good AI will read the details back and get your yes first — and you should expect it to.</w:t>
       </w:r>
     </w:p>
     <w:p>

</xml_diff>